<commit_message>
Some updates to figures
</commit_message>
<xml_diff>
--- a/outputs/main figures/Table1_IslandSummary.docx
+++ b/outputs/main figures/Table1_IslandSummary.docx
@@ -528,7 +528,7 @@
                 <w:rFonts w:ascii="Calibri" w:hAnsi="Calibri"/>
                 <w:sz w:val="20"/>
               </w:rPr>
-              <w:t xml:space="default">1.12 (0.20)</w:t>
+              <w:t xml:space="default">1.11 (0.20)</w:t>
             </w:r>
           </w:p>
         </w:tc>
@@ -725,7 +725,7 @@
                 <w:rFonts w:ascii="Calibri" w:hAnsi="Calibri"/>
                 <w:sz w:val="20"/>
               </w:rPr>
-              <w:t xml:space="default">1.51 (0.17)</w:t>
+              <w:t xml:space="default">1.49 (0.16)</w:t>
             </w:r>
           </w:p>
         </w:tc>
@@ -922,7 +922,7 @@
                 <w:rFonts w:ascii="Calibri" w:hAnsi="Calibri"/>
                 <w:sz w:val="20"/>
               </w:rPr>
-              <w:t xml:space="default">1.14 (0.35)</w:t>
+              <w:t xml:space="default">1.13 (0.34)</w:t>
             </w:r>
           </w:p>
         </w:tc>
@@ -1316,7 +1316,7 @@
                 <w:rFonts w:ascii="Calibri" w:hAnsi="Calibri"/>
                 <w:sz w:val="20"/>
               </w:rPr>
-              <w:t xml:space="default">1.20 (0.40)</w:t>
+              <w:t xml:space="default">1.18 (0.39)</w:t>
             </w:r>
           </w:p>
         </w:tc>
@@ -2104,7 +2104,7 @@
                 <w:rFonts w:ascii="Calibri" w:hAnsi="Calibri"/>
                 <w:sz w:val="20"/>
               </w:rPr>
-              <w:t xml:space="default">0.46 (0.48)</w:t>
+              <w:t xml:space="default">0.45 (0.47)</w:t>
             </w:r>
           </w:p>
         </w:tc>
@@ -2301,7 +2301,7 @@
                 <w:rFonts w:ascii="Calibri" w:hAnsi="Calibri"/>
                 <w:sz w:val="20"/>
               </w:rPr>
-              <w:t xml:space="default">0.62 (0.19)</w:t>
+              <w:t xml:space="default">0.61 (0.19)</w:t>
             </w:r>
           </w:p>
         </w:tc>
@@ -2498,7 +2498,7 @@
                 <w:rFonts w:ascii="Calibri" w:hAnsi="Calibri"/>
                 <w:sz w:val="20"/>
               </w:rPr>
-              <w:t xml:space="default">-1.13 (0.10)</w:t>
+              <w:t xml:space="default">-1.11 (0.10)</w:t>
             </w:r>
           </w:p>
         </w:tc>
@@ -2695,7 +2695,7 @@
                 <w:rFonts w:ascii="Calibri" w:hAnsi="Calibri"/>
                 <w:sz w:val="20"/>
               </w:rPr>
-              <w:t xml:space="default">-2.24 (0.09)</w:t>
+              <w:t xml:space="default">-2.21 (0.09)</w:t>
             </w:r>
           </w:p>
         </w:tc>

</xml_diff>

<commit_message>
Changing porosity calculation and some tweaks to figures
</commit_message>
<xml_diff>
--- a/outputs/main figures/Table1_IslandSummary.docx
+++ b/outputs/main figures/Table1_IslandSummary.docx
@@ -528,7 +528,7 @@
                 <w:rFonts w:ascii="Calibri" w:hAnsi="Calibri"/>
                 <w:sz w:val="20"/>
               </w:rPr>
-              <w:t xml:space="default">1.11 (0.20)</w:t>
+              <w:t xml:space="default">1.15 (0.20)</w:t>
             </w:r>
           </w:p>
         </w:tc>
@@ -725,7 +725,7 @@
                 <w:rFonts w:ascii="Calibri" w:hAnsi="Calibri"/>
                 <w:sz w:val="20"/>
               </w:rPr>
-              <w:t xml:space="default">1.49 (0.16)</w:t>
+              <w:t xml:space="default">1.51 (0.15)</w:t>
             </w:r>
           </w:p>
         </w:tc>
@@ -922,7 +922,7 @@
                 <w:rFonts w:ascii="Calibri" w:hAnsi="Calibri"/>
                 <w:sz w:val="20"/>
               </w:rPr>
-              <w:t xml:space="default">1.13 (0.34)</w:t>
+              <w:t xml:space="default">1.18 (0.36)</w:t>
             </w:r>
           </w:p>
         </w:tc>
@@ -1119,7 +1119,7 @@
                 <w:rFonts w:ascii="Calibri" w:hAnsi="Calibri"/>
                 <w:sz w:val="20"/>
               </w:rPr>
-              <w:t xml:space="default">0.45 (0.20)</w:t>
+              <w:t xml:space="default">0.42 (0.19)</w:t>
             </w:r>
           </w:p>
         </w:tc>
@@ -1316,7 +1316,7 @@
                 <w:rFonts w:ascii="Calibri" w:hAnsi="Calibri"/>
                 <w:sz w:val="20"/>
               </w:rPr>
-              <w:t xml:space="default">1.18 (0.39)</w:t>
+              <w:t xml:space="default">1.30 (0.46)</w:t>
             </w:r>
           </w:p>
         </w:tc>
@@ -2104,7 +2104,7 @@
                 <w:rFonts w:ascii="Calibri" w:hAnsi="Calibri"/>
                 <w:sz w:val="20"/>
               </w:rPr>
-              <w:t xml:space="default">0.45 (0.47)</w:t>
+              <w:t xml:space="default">0.43 (0.48)</w:t>
             </w:r>
           </w:p>
         </w:tc>
@@ -2301,7 +2301,7 @@
                 <w:rFonts w:ascii="Calibri" w:hAnsi="Calibri"/>
                 <w:sz w:val="20"/>
               </w:rPr>
-              <w:t xml:space="default">0.61 (0.19)</w:t>
+              <w:t xml:space="default">0.63 (0.20)</w:t>
             </w:r>
           </w:p>
         </w:tc>
@@ -2498,7 +2498,7 @@
                 <w:rFonts w:ascii="Calibri" w:hAnsi="Calibri"/>
                 <w:sz w:val="20"/>
               </w:rPr>
-              <w:t xml:space="default">-1.11 (0.10)</w:t>
+              <w:t xml:space="default">-1.12 (0.10)</w:t>
             </w:r>
           </w:p>
         </w:tc>
@@ -2695,7 +2695,7 @@
                 <w:rFonts w:ascii="Calibri" w:hAnsi="Calibri"/>
                 <w:sz w:val="20"/>
               </w:rPr>
-              <w:t xml:space="default">-2.21 (0.09)</w:t>
+              <w:t xml:space="default">-2.28 (0.09)</w:t>
             </w:r>
           </w:p>
         </w:tc>

</xml_diff>